<commit_message>
Update term project document with screenshot
</commit_message>
<xml_diff>
--- a/DF_TermProject_Spring2026_final.docx
+++ b/DF_TermProject_Spring2026_final.docx
@@ -17639,6 +17639,7 @@
                 <w:sz w:val="20"/>
                 <w:szCs w:val="20"/>
               </w:rPr>
+              <w:lastRenderedPageBreak/>
               <w:t>Term Project .docx visible in GitHub Repository file listing</w:t>
             </w:r>
           </w:p>
@@ -17662,14 +17663,41 @@
           </w:tcPr>
           <w:p>
             <w:r>
-              <w:rPr>
-                <w:i/>
-                <w:iCs/>
-                <w:color w:val="595959"/>
-                <w:sz w:val="20"/>
-                <w:szCs w:val="20"/>
-              </w:rPr>
-              <w:t>[Paste screenshot here]</w:t>
+              <w:drawing>
+                <wp:inline distT="0" distB="0" distL="0" distR="0" wp14:anchorId="0E59C30E" wp14:editId="249C9D7F">
+                  <wp:extent cx="6400800" cy="3003550"/>
+                  <wp:effectExtent l="0" t="0" r="0" b="6350"/>
+                  <wp:docPr id="583373570" name="Picture 1"/>
+                  <wp:cNvGraphicFramePr>
+                    <a:graphicFrameLocks xmlns:a="http://schemas.openxmlformats.org/drawingml/2006/main" noChangeAspect="1"/>
+                  </wp:cNvGraphicFramePr>
+                  <a:graphic xmlns:a="http://schemas.openxmlformats.org/drawingml/2006/main">
+                    <a:graphicData uri="http://schemas.openxmlformats.org/drawingml/2006/picture">
+                      <pic:pic xmlns:pic="http://schemas.openxmlformats.org/drawingml/2006/picture">
+                        <pic:nvPicPr>
+                          <pic:cNvPr id="583373570" name=""/>
+                          <pic:cNvPicPr/>
+                        </pic:nvPicPr>
+                        <pic:blipFill>
+                          <a:blip r:embed="rId20"/>
+                          <a:stretch>
+                            <a:fillRect/>
+                          </a:stretch>
+                        </pic:blipFill>
+                        <pic:spPr>
+                          <a:xfrm>
+                            <a:off x="0" y="0"/>
+                            <a:ext cx="6400800" cy="3003550"/>
+                          </a:xfrm>
+                          <a:prstGeom prst="rect">
+                            <a:avLst/>
+                          </a:prstGeom>
+                        </pic:spPr>
+                      </pic:pic>
+                    </a:graphicData>
+                  </a:graphic>
+                </wp:inline>
+              </w:drawing>
             </w:r>
           </w:p>
         </w:tc>
@@ -19992,8 +20020,8 @@
     </w:tbl>
     <w:p/>
     <w:sectPr>
-      <w:headerReference w:type="default" r:id="rId20"/>
-      <w:footerReference w:type="default" r:id="rId21"/>
+      <w:headerReference w:type="default" r:id="rId21"/>
+      <w:footerReference w:type="default" r:id="rId22"/>
       <w:pgSz w:w="12240" w:h="15840"/>
       <w:pgMar w:top="1080" w:right="1080" w:bottom="1080" w:left="1080" w:header="708" w:footer="708" w:gutter="0"/>
       <w:cols w:space="720"/>

</xml_diff>

<commit_message>
Update final term project document
</commit_message>
<xml_diff>
--- a/DF_TermProject_Spring2026_final.docx
+++ b/DF_TermProject_Spring2026_final.docx
@@ -1404,10 +1404,7 @@
               <w:jc w:val="both"/>
             </w:pPr>
             <w:r>
-              <w:t>feature/</w:t>
-            </w:r>
-            <w:r>
-              <w:t>wahab0724/</w:t>
+              <w:t>feature/wahab0724/</w:t>
             </w:r>
             <w:proofErr w:type="spellStart"/>
             <w:r>
@@ -1632,13 +1629,7 @@
               <w:jc w:val="both"/>
             </w:pPr>
             <w:r>
-              <w:t>f</w:t>
-            </w:r>
-            <w:r>
-              <w:t>eature</w:t>
-            </w:r>
-            <w:r>
-              <w:t>/</w:t>
+              <w:t>feature/</w:t>
             </w:r>
             <w:proofErr w:type="spellStart"/>
             <w:r>
@@ -17568,8 +17559,8 @@
         <w:tblLook w:val="04A0" w:firstRow="1" w:lastRow="0" w:firstColumn="1" w:lastColumn="0" w:noHBand="0" w:noVBand="1"/>
       </w:tblPr>
       <w:tblGrid>
-        <w:gridCol w:w="1378"/>
-        <w:gridCol w:w="8700"/>
+        <w:gridCol w:w="1542"/>
+        <w:gridCol w:w="8536"/>
       </w:tblGrid>
       <w:tr>
         <w:tc>
@@ -17703,9 +17694,9 @@
                 <w:noProof/>
               </w:rPr>
               <w:drawing>
-                <wp:inline distT="0" distB="0" distL="0" distR="0" wp14:anchorId="42D5A710" wp14:editId="6D3EA227">
-                  <wp:extent cx="6400800" cy="3750310"/>
-                  <wp:effectExtent l="0" t="0" r="0" b="2540"/>
+                <wp:inline distT="0" distB="0" distL="0" distR="0" wp14:anchorId="42D5A710" wp14:editId="5C4FF944">
+                  <wp:extent cx="5486400" cy="3214551"/>
+                  <wp:effectExtent l="0" t="0" r="0" b="5080"/>
                   <wp:docPr id="1441451676" name="Picture 13"/>
                   <wp:cNvGraphicFramePr>
                     <a:graphicFrameLocks xmlns:a="http://schemas.openxmlformats.org/drawingml/2006/main" noChangeAspect="1"/>
@@ -17715,59 +17706,6 @@
                       <pic:pic xmlns:pic="http://schemas.openxmlformats.org/drawingml/2006/picture">
                         <pic:nvPicPr>
                           <pic:cNvPr id="0" name="Picture 27"/>
-                          <pic:cNvPicPr>
-                            <a:picLocks noChangeAspect="1" noChangeArrowheads="1"/>
-                          </pic:cNvPicPr>
-                        </pic:nvPicPr>
-                        <pic:blipFill>
-                          <a:blip r:embed="rId7">
-                            <a:extLst>
-                              <a:ext uri="{28A0092B-C50C-407E-A947-70E740481C1C}">
-                                <a14:useLocalDpi xmlns:a14="http://schemas.microsoft.com/office/drawing/2010/main" val="0"/>
-                              </a:ext>
-                            </a:extLst>
-                          </a:blip>
-                          <a:srcRect/>
-                          <a:stretch>
-                            <a:fillRect/>
-                          </a:stretch>
-                        </pic:blipFill>
-                        <pic:spPr bwMode="auto">
-                          <a:xfrm>
-                            <a:off x="0" y="0"/>
-                            <a:ext cx="6400800" cy="3750310"/>
-                          </a:xfrm>
-                          <a:prstGeom prst="rect">
-                            <a:avLst/>
-                          </a:prstGeom>
-                          <a:noFill/>
-                          <a:ln>
-                            <a:noFill/>
-                          </a:ln>
-                        </pic:spPr>
-                      </pic:pic>
-                    </a:graphicData>
-                  </a:graphic>
-                </wp:inline>
-              </w:drawing>
-            </w:r>
-            <w:r>
-              <w:rPr>
-                <w:noProof/>
-              </w:rPr>
-              <w:drawing>
-                <wp:inline distT="0" distB="0" distL="0" distR="0" wp14:anchorId="1976E51C" wp14:editId="2A0C17A7">
-                  <wp:extent cx="6400800" cy="2780030"/>
-                  <wp:effectExtent l="0" t="0" r="0" b="1270"/>
-                  <wp:docPr id="1674124911" name="Picture 12"/>
-                  <wp:cNvGraphicFramePr>
-                    <a:graphicFrameLocks xmlns:a="http://schemas.openxmlformats.org/drawingml/2006/main" noChangeAspect="1"/>
-                  </wp:cNvGraphicFramePr>
-                  <a:graphic xmlns:a="http://schemas.openxmlformats.org/drawingml/2006/main">
-                    <a:graphicData uri="http://schemas.openxmlformats.org/drawingml/2006/picture">
-                      <pic:pic xmlns:pic="http://schemas.openxmlformats.org/drawingml/2006/picture">
-                        <pic:nvPicPr>
-                          <pic:cNvPr id="0" name="Picture 26"/>
                           <pic:cNvPicPr>
                             <a:picLocks noChangeAspect="1" noChangeArrowheads="1"/>
                           </pic:cNvPicPr>
@@ -17788,7 +17726,7 @@
                         <pic:spPr bwMode="auto">
                           <a:xfrm>
                             <a:off x="0" y="0"/>
-                            <a:ext cx="6400800" cy="2780030"/>
+                            <a:ext cx="5486400" cy="3214551"/>
                           </a:xfrm>
                           <a:prstGeom prst="rect">
                             <a:avLst/>
@@ -17804,75 +17742,15 @@
                 </wp:inline>
               </w:drawing>
             </w:r>
-          </w:p>
-        </w:tc>
-      </w:tr>
-      <w:tr>
-        <w:tc>
-          <w:tcPr>
-            <w:tcW w:w="3200" w:type="dxa"/>
-            <w:tcBorders>
-              <w:top w:val="single" w:sz="1" w:space="0" w:color="AAAAAA"/>
-              <w:left w:val="single" w:sz="1" w:space="0" w:color="AAAAAA"/>
-              <w:bottom w:val="single" w:sz="1" w:space="0" w:color="AAAAAA"/>
-              <w:right w:val="single" w:sz="1" w:space="0" w:color="AAAAAA"/>
-            </w:tcBorders>
-            <w:shd w:val="clear" w:color="auto" w:fill="FFFFFF"/>
-            <w:tcMar>
-              <w:top w:w="80" w:type="dxa"/>
-              <w:left w:w="120" w:type="dxa"/>
-              <w:bottom w:w="80" w:type="dxa"/>
-              <w:right w:w="120" w:type="dxa"/>
-            </w:tcMar>
-            <w:vAlign w:val="center"/>
-          </w:tcPr>
-          <w:p>
-            <w:pPr>
-              <w:jc w:val="both"/>
-            </w:pPr>
-            <w:r>
-              <w:rPr>
-                <w:b/>
-                <w:bCs/>
-                <w:color w:val="000000"/>
-                <w:sz w:val="20"/>
-                <w:szCs w:val="20"/>
-              </w:rPr>
-              <w:lastRenderedPageBreak/>
-              <w:t>CI Workflow Runs – Triggered by each member's PR on develop (all steps green)</w:t>
-            </w:r>
-          </w:p>
-        </w:tc>
-        <w:tc>
-          <w:tcPr>
-            <w:tcW w:w="6160" w:type="dxa"/>
-            <w:tcBorders>
-              <w:top w:val="single" w:sz="1" w:space="0" w:color="AAAAAA"/>
-              <w:left w:val="single" w:sz="1" w:space="0" w:color="AAAAAA"/>
-              <w:bottom w:val="single" w:sz="1" w:space="0" w:color="AAAAAA"/>
-              <w:right w:val="single" w:sz="1" w:space="0" w:color="AAAAAA"/>
-            </w:tcBorders>
-            <w:shd w:val="clear" w:color="auto" w:fill="FFFFFF"/>
-            <w:tcMar>
-              <w:top w:w="80" w:type="dxa"/>
-              <w:left w:w="120" w:type="dxa"/>
-              <w:bottom w:w="80" w:type="dxa"/>
-              <w:right w:w="120" w:type="dxa"/>
-            </w:tcMar>
-          </w:tcPr>
-          <w:p>
-            <w:pPr>
-              <w:jc w:val="both"/>
-            </w:pPr>
             <w:r>
               <w:rPr>
                 <w:noProof/>
               </w:rPr>
               <w:drawing>
-                <wp:inline distT="0" distB="0" distL="0" distR="0" wp14:anchorId="21F7AE19" wp14:editId="78729296">
-                  <wp:extent cx="6400800" cy="3016885"/>
+                <wp:inline distT="0" distB="0" distL="0" distR="0" wp14:anchorId="1976E51C" wp14:editId="6D83D0B4">
+                  <wp:extent cx="5486400" cy="2382883"/>
                   <wp:effectExtent l="0" t="0" r="0" b="0"/>
-                  <wp:docPr id="1948889459" name="Picture 17"/>
+                  <wp:docPr id="1674124911" name="Picture 12"/>
                   <wp:cNvGraphicFramePr>
                     <a:graphicFrameLocks xmlns:a="http://schemas.openxmlformats.org/drawingml/2006/main" noChangeAspect="1"/>
                   </wp:cNvGraphicFramePr>
@@ -17880,13 +17758,13 @@
                     <a:graphicData uri="http://schemas.openxmlformats.org/drawingml/2006/picture">
                       <pic:pic xmlns:pic="http://schemas.openxmlformats.org/drawingml/2006/picture">
                         <pic:nvPicPr>
-                          <pic:cNvPr id="0" name="Picture 34"/>
+                          <pic:cNvPr id="0" name="Picture 26"/>
                           <pic:cNvPicPr>
                             <a:picLocks noChangeAspect="1" noChangeArrowheads="1"/>
                           </pic:cNvPicPr>
                         </pic:nvPicPr>
                         <pic:blipFill>
-                          <a:blip r:embed="rId9" cstate="print">
+                          <a:blip r:embed="rId9">
                             <a:extLst>
                               <a:ext uri="{28A0092B-C50C-407E-A947-70E740481C1C}">
                                 <a14:useLocalDpi xmlns:a14="http://schemas.microsoft.com/office/drawing/2010/main" val="0"/>
@@ -17901,7 +17779,7 @@
                         <pic:spPr bwMode="auto">
                           <a:xfrm>
                             <a:off x="0" y="0"/>
-                            <a:ext cx="6400800" cy="3016885"/>
+                            <a:ext cx="5486400" cy="2382883"/>
                           </a:xfrm>
                           <a:prstGeom prst="rect">
                             <a:avLst/>
@@ -17917,15 +17795,75 @@
                 </wp:inline>
               </w:drawing>
             </w:r>
+          </w:p>
+        </w:tc>
+      </w:tr>
+      <w:tr>
+        <w:tc>
+          <w:tcPr>
+            <w:tcW w:w="3200" w:type="dxa"/>
+            <w:tcBorders>
+              <w:top w:val="single" w:sz="1" w:space="0" w:color="AAAAAA"/>
+              <w:left w:val="single" w:sz="1" w:space="0" w:color="AAAAAA"/>
+              <w:bottom w:val="single" w:sz="1" w:space="0" w:color="AAAAAA"/>
+              <w:right w:val="single" w:sz="1" w:space="0" w:color="AAAAAA"/>
+            </w:tcBorders>
+            <w:shd w:val="clear" w:color="auto" w:fill="FFFFFF"/>
+            <w:tcMar>
+              <w:top w:w="80" w:type="dxa"/>
+              <w:left w:w="120" w:type="dxa"/>
+              <w:bottom w:w="80" w:type="dxa"/>
+              <w:right w:w="120" w:type="dxa"/>
+            </w:tcMar>
+            <w:vAlign w:val="center"/>
+          </w:tcPr>
+          <w:p>
+            <w:pPr>
+              <w:jc w:val="both"/>
+            </w:pPr>
+            <w:r>
+              <w:rPr>
+                <w:b/>
+                <w:bCs/>
+                <w:color w:val="000000"/>
+                <w:sz w:val="20"/>
+                <w:szCs w:val="20"/>
+              </w:rPr>
+              <w:lastRenderedPageBreak/>
+              <w:t>CI Workflow Runs – Triggered by each member's PR on develop (all steps green)</w:t>
+            </w:r>
+          </w:p>
+        </w:tc>
+        <w:tc>
+          <w:tcPr>
+            <w:tcW w:w="6160" w:type="dxa"/>
+            <w:tcBorders>
+              <w:top w:val="single" w:sz="1" w:space="0" w:color="AAAAAA"/>
+              <w:left w:val="single" w:sz="1" w:space="0" w:color="AAAAAA"/>
+              <w:bottom w:val="single" w:sz="1" w:space="0" w:color="AAAAAA"/>
+              <w:right w:val="single" w:sz="1" w:space="0" w:color="AAAAAA"/>
+            </w:tcBorders>
+            <w:shd w:val="clear" w:color="auto" w:fill="FFFFFF"/>
+            <w:tcMar>
+              <w:top w:w="80" w:type="dxa"/>
+              <w:left w:w="120" w:type="dxa"/>
+              <w:bottom w:w="80" w:type="dxa"/>
+              <w:right w:w="120" w:type="dxa"/>
+            </w:tcMar>
+          </w:tcPr>
+          <w:p>
+            <w:pPr>
+              <w:jc w:val="both"/>
+            </w:pPr>
             <w:r>
               <w:rPr>
                 <w:noProof/>
               </w:rPr>
               <w:drawing>
-                <wp:inline distT="0" distB="0" distL="0" distR="0" wp14:anchorId="35DEC914" wp14:editId="4B2F80F2">
-                  <wp:extent cx="6400800" cy="3003550"/>
-                  <wp:effectExtent l="0" t="0" r="0" b="6350"/>
-                  <wp:docPr id="469338810" name="Picture 16"/>
+                <wp:inline distT="0" distB="0" distL="0" distR="0" wp14:anchorId="21F7AE19" wp14:editId="6ECFDCE2">
+                  <wp:extent cx="5486400" cy="2585901"/>
+                  <wp:effectExtent l="0" t="0" r="0" b="5080"/>
+                  <wp:docPr id="1948889459" name="Picture 17"/>
                   <wp:cNvGraphicFramePr>
                     <a:graphicFrameLocks xmlns:a="http://schemas.openxmlformats.org/drawingml/2006/main" noChangeAspect="1"/>
                   </wp:cNvGraphicFramePr>
@@ -17933,7 +17871,7 @@
                     <a:graphicData uri="http://schemas.openxmlformats.org/drawingml/2006/picture">
                       <pic:pic xmlns:pic="http://schemas.openxmlformats.org/drawingml/2006/picture">
                         <pic:nvPicPr>
-                          <pic:cNvPr id="0" name="Picture 33"/>
+                          <pic:cNvPr id="0" name="Picture 34"/>
                           <pic:cNvPicPr>
                             <a:picLocks noChangeAspect="1" noChangeArrowheads="1"/>
                           </pic:cNvPicPr>
@@ -17954,7 +17892,7 @@
                         <pic:spPr bwMode="auto">
                           <a:xfrm>
                             <a:off x="0" y="0"/>
-                            <a:ext cx="6400800" cy="3003550"/>
+                            <a:ext cx="5486400" cy="2585901"/>
                           </a:xfrm>
                           <a:prstGeom prst="rect">
                             <a:avLst/>
@@ -17974,12 +17912,11 @@
               <w:rPr>
                 <w:noProof/>
               </w:rPr>
-              <w:lastRenderedPageBreak/>
               <w:drawing>
-                <wp:inline distT="0" distB="0" distL="0" distR="0" wp14:anchorId="3ED4CF7E" wp14:editId="1C999680">
-                  <wp:extent cx="6400800" cy="3006725"/>
-                  <wp:effectExtent l="0" t="0" r="0" b="3175"/>
-                  <wp:docPr id="1050503312" name="Picture 15"/>
+                <wp:inline distT="0" distB="0" distL="0" distR="0" wp14:anchorId="35DEC914" wp14:editId="12194745">
+                  <wp:extent cx="5486400" cy="2574471"/>
+                  <wp:effectExtent l="0" t="0" r="0" b="0"/>
+                  <wp:docPr id="469338810" name="Picture 16"/>
                   <wp:cNvGraphicFramePr>
                     <a:graphicFrameLocks xmlns:a="http://schemas.openxmlformats.org/drawingml/2006/main" noChangeAspect="1"/>
                   </wp:cNvGraphicFramePr>
@@ -17987,7 +17924,7 @@
                     <a:graphicData uri="http://schemas.openxmlformats.org/drawingml/2006/picture">
                       <pic:pic xmlns:pic="http://schemas.openxmlformats.org/drawingml/2006/picture">
                         <pic:nvPicPr>
-                          <pic:cNvPr id="0" name="Picture 32"/>
+                          <pic:cNvPr id="0" name="Picture 33"/>
                           <pic:cNvPicPr>
                             <a:picLocks noChangeAspect="1" noChangeArrowheads="1"/>
                           </pic:cNvPicPr>
@@ -18008,7 +17945,7 @@
                         <pic:spPr bwMode="auto">
                           <a:xfrm>
                             <a:off x="0" y="0"/>
-                            <a:ext cx="6400800" cy="3006725"/>
+                            <a:ext cx="5486400" cy="2574471"/>
                           </a:xfrm>
                           <a:prstGeom prst="rect">
                             <a:avLst/>
@@ -18024,74 +17961,15 @@
                 </wp:inline>
               </w:drawing>
             </w:r>
-          </w:p>
-        </w:tc>
-      </w:tr>
-      <w:tr>
-        <w:tc>
-          <w:tcPr>
-            <w:tcW w:w="3200" w:type="dxa"/>
-            <w:tcBorders>
-              <w:top w:val="single" w:sz="1" w:space="0" w:color="AAAAAA"/>
-              <w:left w:val="single" w:sz="1" w:space="0" w:color="AAAAAA"/>
-              <w:bottom w:val="single" w:sz="1" w:space="0" w:color="AAAAAA"/>
-              <w:right w:val="single" w:sz="1" w:space="0" w:color="AAAAAA"/>
-            </w:tcBorders>
-            <w:shd w:val="clear" w:color="auto" w:fill="EBF3FA"/>
-            <w:tcMar>
-              <w:top w:w="80" w:type="dxa"/>
-              <w:left w:w="120" w:type="dxa"/>
-              <w:bottom w:w="80" w:type="dxa"/>
-              <w:right w:w="120" w:type="dxa"/>
-            </w:tcMar>
-            <w:vAlign w:val="center"/>
-          </w:tcPr>
-          <w:p>
-            <w:pPr>
-              <w:jc w:val="both"/>
-            </w:pPr>
-            <w:r>
-              <w:rPr>
-                <w:b/>
-                <w:bCs/>
-                <w:color w:val="000000"/>
-                <w:sz w:val="20"/>
-                <w:szCs w:val="20"/>
-              </w:rPr>
-              <w:t>Docker Hub – Pushed Images with All Environment Tags (dev, staging, prod)</w:t>
-            </w:r>
-          </w:p>
-        </w:tc>
-        <w:tc>
-          <w:tcPr>
-            <w:tcW w:w="6160" w:type="dxa"/>
-            <w:tcBorders>
-              <w:top w:val="single" w:sz="1" w:space="0" w:color="AAAAAA"/>
-              <w:left w:val="single" w:sz="1" w:space="0" w:color="AAAAAA"/>
-              <w:bottom w:val="single" w:sz="1" w:space="0" w:color="AAAAAA"/>
-              <w:right w:val="single" w:sz="1" w:space="0" w:color="AAAAAA"/>
-            </w:tcBorders>
-            <w:shd w:val="clear" w:color="auto" w:fill="EBF3FA"/>
-            <w:tcMar>
-              <w:top w:w="80" w:type="dxa"/>
-              <w:left w:w="120" w:type="dxa"/>
-              <w:bottom w:w="80" w:type="dxa"/>
-              <w:right w:w="120" w:type="dxa"/>
-            </w:tcMar>
-          </w:tcPr>
-          <w:p>
-            <w:pPr>
-              <w:jc w:val="both"/>
-            </w:pPr>
             <w:r>
               <w:rPr>
                 <w:noProof/>
               </w:rPr>
               <w:drawing>
-                <wp:inline distT="0" distB="0" distL="0" distR="0" wp14:anchorId="18E57E37" wp14:editId="48FE3C9C">
-                  <wp:extent cx="6400800" cy="2804160"/>
+                <wp:inline distT="0" distB="0" distL="0" distR="0" wp14:anchorId="3ED4CF7E" wp14:editId="1C12A38E">
+                  <wp:extent cx="5486400" cy="2577193"/>
                   <wp:effectExtent l="0" t="0" r="0" b="0"/>
-                  <wp:docPr id="318106762" name="Picture 10"/>
+                  <wp:docPr id="1050503312" name="Picture 15"/>
                   <wp:cNvGraphicFramePr>
                     <a:graphicFrameLocks xmlns:a="http://schemas.openxmlformats.org/drawingml/2006/main" noChangeAspect="1"/>
                   </wp:cNvGraphicFramePr>
@@ -18099,13 +17977,13 @@
                     <a:graphicData uri="http://schemas.openxmlformats.org/drawingml/2006/picture">
                       <pic:pic xmlns:pic="http://schemas.openxmlformats.org/drawingml/2006/picture">
                         <pic:nvPicPr>
-                          <pic:cNvPr id="0" name="Picture 19"/>
+                          <pic:cNvPr id="0" name="Picture 32"/>
                           <pic:cNvPicPr>
                             <a:picLocks noChangeAspect="1" noChangeArrowheads="1"/>
                           </pic:cNvPicPr>
                         </pic:nvPicPr>
                         <pic:blipFill>
-                          <a:blip r:embed="rId12">
+                          <a:blip r:embed="rId12" cstate="print">
                             <a:extLst>
                               <a:ext uri="{28A0092B-C50C-407E-A947-70E740481C1C}">
                                 <a14:useLocalDpi xmlns:a14="http://schemas.microsoft.com/office/drawing/2010/main" val="0"/>
@@ -18120,7 +17998,7 @@
                         <pic:spPr bwMode="auto">
                           <a:xfrm>
                             <a:off x="0" y="0"/>
-                            <a:ext cx="6400800" cy="2804160"/>
+                            <a:ext cx="5486400" cy="2577193"/>
                           </a:xfrm>
                           <a:prstGeom prst="rect">
                             <a:avLst/>
@@ -18136,16 +18014,6 @@
                 </wp:inline>
               </w:drawing>
             </w:r>
-            <w:r>
-              <w:rPr>
-                <w:i/>
-                <w:iCs/>
-                <w:color w:val="595959"/>
-                <w:sz w:val="20"/>
-                <w:szCs w:val="20"/>
-              </w:rPr>
-              <w:t xml:space="preserve"> </w:t>
-            </w:r>
           </w:p>
         </w:tc>
       </w:tr>
@@ -18159,7 +18027,7 @@
               <w:bottom w:val="single" w:sz="1" w:space="0" w:color="AAAAAA"/>
               <w:right w:val="single" w:sz="1" w:space="0" w:color="AAAAAA"/>
             </w:tcBorders>
-            <w:shd w:val="clear" w:color="auto" w:fill="FFFFFF"/>
+            <w:shd w:val="clear" w:color="auto" w:fill="EBF3FA"/>
             <w:tcMar>
               <w:top w:w="80" w:type="dxa"/>
               <w:left w:w="120" w:type="dxa"/>
@@ -18181,7 +18049,7 @@
                 <w:szCs w:val="20"/>
               </w:rPr>
               <w:lastRenderedPageBreak/>
-              <w:t>CD Workflow Runs – All three environments triggered by push events</w:t>
+              <w:t>Docker Hub – Pushed Images with All Environment Tags (dev, staging, prod)</w:t>
             </w:r>
           </w:p>
         </w:tc>
@@ -18194,7 +18062,7 @@
               <w:bottom w:val="single" w:sz="1" w:space="0" w:color="AAAAAA"/>
               <w:right w:val="single" w:sz="1" w:space="0" w:color="AAAAAA"/>
             </w:tcBorders>
-            <w:shd w:val="clear" w:color="auto" w:fill="FFFFFF"/>
+            <w:shd w:val="clear" w:color="auto" w:fill="EBF3FA"/>
             <w:tcMar>
               <w:top w:w="80" w:type="dxa"/>
               <w:left w:w="120" w:type="dxa"/>
@@ -18211,10 +18079,10 @@
                 <w:noProof/>
               </w:rPr>
               <w:drawing>
-                <wp:inline distT="0" distB="0" distL="0" distR="0" wp14:anchorId="2F4F5D82" wp14:editId="2B274548">
-                  <wp:extent cx="6400800" cy="3013710"/>
+                <wp:inline distT="0" distB="0" distL="0" distR="0" wp14:anchorId="18E57E37" wp14:editId="1CDB171E">
+                  <wp:extent cx="5486400" cy="2403566"/>
                   <wp:effectExtent l="0" t="0" r="0" b="0"/>
-                  <wp:docPr id="1104392522" name="Picture 20"/>
+                  <wp:docPr id="318106762" name="Picture 10"/>
                   <wp:cNvGraphicFramePr>
                     <a:graphicFrameLocks xmlns:a="http://schemas.openxmlformats.org/drawingml/2006/main" noChangeAspect="1"/>
                   </wp:cNvGraphicFramePr>
@@ -18222,7 +18090,7 @@
                     <a:graphicData uri="http://schemas.openxmlformats.org/drawingml/2006/picture">
                       <pic:pic xmlns:pic="http://schemas.openxmlformats.org/drawingml/2006/picture">
                         <pic:nvPicPr>
-                          <pic:cNvPr id="0" name="Picture 40"/>
+                          <pic:cNvPr id="0" name="Picture 19"/>
                           <pic:cNvPicPr>
                             <a:picLocks noChangeAspect="1" noChangeArrowheads="1"/>
                           </pic:cNvPicPr>
@@ -18243,7 +18111,7 @@
                         <pic:spPr bwMode="auto">
                           <a:xfrm>
                             <a:off x="0" y="0"/>
-                            <a:ext cx="6400800" cy="3013710"/>
+                            <a:ext cx="5486400" cy="2403566"/>
                           </a:xfrm>
                           <a:prstGeom prst="rect">
                             <a:avLst/>
@@ -18261,13 +18129,83 @@
             </w:r>
             <w:r>
               <w:rPr>
+                <w:i/>
+                <w:iCs/>
+                <w:color w:val="595959"/>
+                <w:sz w:val="20"/>
+                <w:szCs w:val="20"/>
+              </w:rPr>
+              <w:t xml:space="preserve"> </w:t>
+            </w:r>
+          </w:p>
+        </w:tc>
+      </w:tr>
+      <w:tr>
+        <w:tc>
+          <w:tcPr>
+            <w:tcW w:w="3200" w:type="dxa"/>
+            <w:tcBorders>
+              <w:top w:val="single" w:sz="1" w:space="0" w:color="AAAAAA"/>
+              <w:left w:val="single" w:sz="1" w:space="0" w:color="AAAAAA"/>
+              <w:bottom w:val="single" w:sz="1" w:space="0" w:color="AAAAAA"/>
+              <w:right w:val="single" w:sz="1" w:space="0" w:color="AAAAAA"/>
+            </w:tcBorders>
+            <w:shd w:val="clear" w:color="auto" w:fill="FFFFFF"/>
+            <w:tcMar>
+              <w:top w:w="80" w:type="dxa"/>
+              <w:left w:w="120" w:type="dxa"/>
+              <w:bottom w:w="80" w:type="dxa"/>
+              <w:right w:w="120" w:type="dxa"/>
+            </w:tcMar>
+            <w:vAlign w:val="center"/>
+          </w:tcPr>
+          <w:p>
+            <w:pPr>
+              <w:jc w:val="both"/>
+            </w:pPr>
+            <w:r>
+              <w:rPr>
+                <w:b/>
+                <w:bCs/>
+                <w:color w:val="000000"/>
+                <w:sz w:val="20"/>
+                <w:szCs w:val="20"/>
+              </w:rPr>
+              <w:lastRenderedPageBreak/>
+              <w:t>CD Workflow Runs – All three environments triggered by push events</w:t>
+            </w:r>
+          </w:p>
+        </w:tc>
+        <w:tc>
+          <w:tcPr>
+            <w:tcW w:w="6160" w:type="dxa"/>
+            <w:tcBorders>
+              <w:top w:val="single" w:sz="1" w:space="0" w:color="AAAAAA"/>
+              <w:left w:val="single" w:sz="1" w:space="0" w:color="AAAAAA"/>
+              <w:bottom w:val="single" w:sz="1" w:space="0" w:color="AAAAAA"/>
+              <w:right w:val="single" w:sz="1" w:space="0" w:color="AAAAAA"/>
+            </w:tcBorders>
+            <w:shd w:val="clear" w:color="auto" w:fill="FFFFFF"/>
+            <w:tcMar>
+              <w:top w:w="80" w:type="dxa"/>
+              <w:left w:w="120" w:type="dxa"/>
+              <w:bottom w:w="80" w:type="dxa"/>
+              <w:right w:w="120" w:type="dxa"/>
+            </w:tcMar>
+          </w:tcPr>
+          <w:p>
+            <w:pPr>
+              <w:jc w:val="both"/>
+            </w:pPr>
+            <w:r>
+              <w:rPr>
                 <w:noProof/>
               </w:rPr>
               <w:drawing>
-                <wp:inline distT="0" distB="0" distL="0" distR="0" wp14:anchorId="12C31FA4" wp14:editId="5A87E9F5">
-                  <wp:extent cx="6400800" cy="2996565"/>
-                  <wp:effectExtent l="0" t="0" r="0" b="0"/>
-                  <wp:docPr id="948828267" name="Picture 19"/>
+                <wp:inline distT="0" distB="0" distL="0" distR="0" wp14:anchorId="2F4F5D82" wp14:editId="73263C10">
+                  <wp:extent cx="5486400" cy="2583180"/>
+                  <wp:effectExtent l="0" t="0" r="0" b="7620"/>
+                  <wp:docPr id="1104392522" name="Picture 20"/>
                   <wp:cNvGraphicFramePr>
                     <a:graphicFrameLocks xmlns:a="http://schemas.openxmlformats.org/drawingml/2006/main" noChangeAspect="1"/>
                   </wp:cNvGraphicFramePr>
@@ -18275,7 +18213,7 @@
                     <a:graphicData uri="http://schemas.openxmlformats.org/drawingml/2006/picture">
                       <pic:pic xmlns:pic="http://schemas.openxmlformats.org/drawingml/2006/picture">
                         <pic:nvPicPr>
-                          <pic:cNvPr id="0" name="Picture 39"/>
+                          <pic:cNvPr id="0" name="Picture 40"/>
                           <pic:cNvPicPr>
                             <a:picLocks noChangeAspect="1" noChangeArrowheads="1"/>
                           </pic:cNvPicPr>
@@ -18296,7 +18234,7 @@
                         <pic:spPr bwMode="auto">
                           <a:xfrm>
                             <a:off x="0" y="0"/>
-                            <a:ext cx="6400800" cy="2996565"/>
+                            <a:ext cx="5486400" cy="2583180"/>
                           </a:xfrm>
                           <a:prstGeom prst="rect">
                             <a:avLst/>
@@ -18316,12 +18254,11 @@
               <w:rPr>
                 <w:noProof/>
               </w:rPr>
-              <w:lastRenderedPageBreak/>
               <w:drawing>
-                <wp:inline distT="0" distB="0" distL="0" distR="0" wp14:anchorId="62A1A121" wp14:editId="26A9C8C5">
-                  <wp:extent cx="6400800" cy="3003550"/>
-                  <wp:effectExtent l="0" t="0" r="0" b="6350"/>
-                  <wp:docPr id="1381778564" name="Picture 18"/>
+                <wp:inline distT="0" distB="0" distL="0" distR="0" wp14:anchorId="12C31FA4" wp14:editId="061BCA22">
+                  <wp:extent cx="5486400" cy="2568484"/>
+                  <wp:effectExtent l="0" t="0" r="0" b="3810"/>
+                  <wp:docPr id="948828267" name="Picture 19"/>
                   <wp:cNvGraphicFramePr>
                     <a:graphicFrameLocks xmlns:a="http://schemas.openxmlformats.org/drawingml/2006/main" noChangeAspect="1"/>
                   </wp:cNvGraphicFramePr>
@@ -18329,7 +18266,7 @@
                     <a:graphicData uri="http://schemas.openxmlformats.org/drawingml/2006/picture">
                       <pic:pic xmlns:pic="http://schemas.openxmlformats.org/drawingml/2006/picture">
                         <pic:nvPicPr>
-                          <pic:cNvPr id="0" name="Picture 38"/>
+                          <pic:cNvPr id="0" name="Picture 39"/>
                           <pic:cNvPicPr>
                             <a:picLocks noChangeAspect="1" noChangeArrowheads="1"/>
                           </pic:cNvPicPr>
@@ -18350,7 +18287,7 @@
                         <pic:spPr bwMode="auto">
                           <a:xfrm>
                             <a:off x="0" y="0"/>
-                            <a:ext cx="6400800" cy="3003550"/>
+                            <a:ext cx="5486400" cy="2568484"/>
                           </a:xfrm>
                           <a:prstGeom prst="rect">
                             <a:avLst/>
@@ -18366,96 +18303,15 @@
                 </wp:inline>
               </w:drawing>
             </w:r>
-          </w:p>
-        </w:tc>
-      </w:tr>
-      <w:tr>
-        <w:tc>
-          <w:tcPr>
-            <w:tcW w:w="3200" w:type="dxa"/>
-            <w:tcBorders>
-              <w:top w:val="single" w:sz="1" w:space="0" w:color="AAAAAA"/>
-              <w:left w:val="single" w:sz="1" w:space="0" w:color="AAAAAA"/>
-              <w:bottom w:val="single" w:sz="1" w:space="0" w:color="AAAAAA"/>
-              <w:right w:val="single" w:sz="1" w:space="0" w:color="AAAAAA"/>
-            </w:tcBorders>
-            <w:shd w:val="clear" w:color="auto" w:fill="EBF3FA"/>
-            <w:tcMar>
-              <w:top w:w="80" w:type="dxa"/>
-              <w:left w:w="120" w:type="dxa"/>
-              <w:bottom w:w="80" w:type="dxa"/>
-              <w:right w:w="120" w:type="dxa"/>
-            </w:tcMar>
-            <w:vAlign w:val="center"/>
-          </w:tcPr>
-          <w:p>
-            <w:pPr>
-              <w:jc w:val="both"/>
-            </w:pPr>
-            <w:r>
-              <w:rPr>
-                <w:b/>
-                <w:bCs/>
-                <w:color w:val="000000"/>
-                <w:sz w:val="20"/>
-                <w:szCs w:val="20"/>
-              </w:rPr>
-              <w:t xml:space="preserve">Live </w:t>
-            </w:r>
-            <w:proofErr w:type="spellStart"/>
-            <w:r>
-              <w:rPr>
-                <w:b/>
-                <w:bCs/>
-                <w:color w:val="000000"/>
-                <w:sz w:val="20"/>
-                <w:szCs w:val="20"/>
-              </w:rPr>
-              <w:t>PakVista</w:t>
-            </w:r>
-            <w:proofErr w:type="spellEnd"/>
-            <w:r>
-              <w:rPr>
-                <w:b/>
-                <w:bCs/>
-                <w:color w:val="000000"/>
-                <w:sz w:val="20"/>
-                <w:szCs w:val="20"/>
-              </w:rPr>
-              <w:t xml:space="preserve"> – Development Render Service (all 5 pages accessible)</w:t>
-            </w:r>
-          </w:p>
-        </w:tc>
-        <w:tc>
-          <w:tcPr>
-            <w:tcW w:w="6160" w:type="dxa"/>
-            <w:tcBorders>
-              <w:top w:val="single" w:sz="1" w:space="0" w:color="AAAAAA"/>
-              <w:left w:val="single" w:sz="1" w:space="0" w:color="AAAAAA"/>
-              <w:bottom w:val="single" w:sz="1" w:space="0" w:color="AAAAAA"/>
-              <w:right w:val="single" w:sz="1" w:space="0" w:color="AAAAAA"/>
-            </w:tcBorders>
-            <w:shd w:val="clear" w:color="auto" w:fill="EBF3FA"/>
-            <w:tcMar>
-              <w:top w:w="80" w:type="dxa"/>
-              <w:left w:w="120" w:type="dxa"/>
-              <w:bottom w:w="80" w:type="dxa"/>
-              <w:right w:w="120" w:type="dxa"/>
-            </w:tcMar>
-          </w:tcPr>
-          <w:p>
-            <w:pPr>
-              <w:jc w:val="both"/>
-            </w:pPr>
             <w:r>
               <w:rPr>
                 <w:noProof/>
               </w:rPr>
               <w:drawing>
-                <wp:inline distT="0" distB="0" distL="0" distR="0" wp14:anchorId="64AC019B" wp14:editId="4ECBF471">
-                  <wp:extent cx="6400800" cy="2850515"/>
-                  <wp:effectExtent l="0" t="0" r="0" b="6985"/>
-                  <wp:docPr id="1965465994" name="Picture 4"/>
+                <wp:inline distT="0" distB="0" distL="0" distR="0" wp14:anchorId="62A1A121" wp14:editId="78984F01">
+                  <wp:extent cx="5486400" cy="2574471"/>
+                  <wp:effectExtent l="0" t="0" r="0" b="0"/>
+                  <wp:docPr id="1381778564" name="Picture 18"/>
                   <wp:cNvGraphicFramePr>
                     <a:graphicFrameLocks xmlns:a="http://schemas.openxmlformats.org/drawingml/2006/main" noChangeAspect="1"/>
                   </wp:cNvGraphicFramePr>
@@ -18463,13 +18319,13 @@
                     <a:graphicData uri="http://schemas.openxmlformats.org/drawingml/2006/picture">
                       <pic:pic xmlns:pic="http://schemas.openxmlformats.org/drawingml/2006/picture">
                         <pic:nvPicPr>
-                          <pic:cNvPr id="0" name="Picture 7"/>
+                          <pic:cNvPr id="0" name="Picture 38"/>
                           <pic:cNvPicPr>
                             <a:picLocks noChangeAspect="1" noChangeArrowheads="1"/>
                           </pic:cNvPicPr>
                         </pic:nvPicPr>
                         <pic:blipFill>
-                          <a:blip r:embed="rId16">
+                          <a:blip r:embed="rId16" cstate="print">
                             <a:extLst>
                               <a:ext uri="{28A0092B-C50C-407E-A947-70E740481C1C}">
                                 <a14:useLocalDpi xmlns:a14="http://schemas.microsoft.com/office/drawing/2010/main" val="0"/>
@@ -18484,7 +18340,7 @@
                         <pic:spPr bwMode="auto">
                           <a:xfrm>
                             <a:off x="0" y="0"/>
-                            <a:ext cx="6400800" cy="2850515"/>
+                            <a:ext cx="5486400" cy="2574471"/>
                           </a:xfrm>
                           <a:prstGeom prst="rect">
                             <a:avLst/>
@@ -18513,7 +18369,7 @@
               <w:bottom w:val="single" w:sz="1" w:space="0" w:color="AAAAAA"/>
               <w:right w:val="single" w:sz="1" w:space="0" w:color="AAAAAA"/>
             </w:tcBorders>
-            <w:shd w:val="clear" w:color="auto" w:fill="FFFFFF"/>
+            <w:shd w:val="clear" w:color="auto" w:fill="EBF3FA"/>
             <w:tcMar>
               <w:top w:w="80" w:type="dxa"/>
               <w:left w:w="120" w:type="dxa"/>
@@ -18557,7 +18413,7 @@
                 <w:sz w:val="20"/>
                 <w:szCs w:val="20"/>
               </w:rPr>
-              <w:t xml:space="preserve"> – Staging Render Service (all 5 pages accessible)</w:t>
+              <w:t xml:space="preserve"> – Development Render Service (all 5 pages accessible)</w:t>
             </w:r>
           </w:p>
         </w:tc>
@@ -18570,7 +18426,7 @@
               <w:bottom w:val="single" w:sz="1" w:space="0" w:color="AAAAAA"/>
               <w:right w:val="single" w:sz="1" w:space="0" w:color="AAAAAA"/>
             </w:tcBorders>
-            <w:shd w:val="clear" w:color="auto" w:fill="FFFFFF"/>
+            <w:shd w:val="clear" w:color="auto" w:fill="EBF3FA"/>
             <w:tcMar>
               <w:top w:w="80" w:type="dxa"/>
               <w:left w:w="120" w:type="dxa"/>
@@ -18587,10 +18443,10 @@
                 <w:noProof/>
               </w:rPr>
               <w:drawing>
-                <wp:inline distT="0" distB="0" distL="0" distR="0" wp14:anchorId="05CA7FA4" wp14:editId="25204872">
-                  <wp:extent cx="6400800" cy="2837815"/>
-                  <wp:effectExtent l="0" t="0" r="0" b="635"/>
-                  <wp:docPr id="1040050821" name="Picture 5"/>
+                <wp:inline distT="0" distB="0" distL="0" distR="0" wp14:anchorId="37FE7411" wp14:editId="0383F69B">
+                  <wp:extent cx="5486400" cy="2911384"/>
+                  <wp:effectExtent l="0" t="0" r="0" b="3810"/>
+                  <wp:docPr id="648996208" name="Picture 6"/>
                   <wp:cNvGraphicFramePr>
                     <a:graphicFrameLocks xmlns:a="http://schemas.openxmlformats.org/drawingml/2006/main" noChangeAspect="1"/>
                   </wp:cNvGraphicFramePr>
@@ -18598,13 +18454,13 @@
                     <a:graphicData uri="http://schemas.openxmlformats.org/drawingml/2006/picture">
                       <pic:pic xmlns:pic="http://schemas.openxmlformats.org/drawingml/2006/picture">
                         <pic:nvPicPr>
-                          <pic:cNvPr id="0" name="Picture 9"/>
+                          <pic:cNvPr id="0" name="Picture 6"/>
                           <pic:cNvPicPr>
                             <a:picLocks noChangeAspect="1" noChangeArrowheads="1"/>
                           </pic:cNvPicPr>
                         </pic:nvPicPr>
                         <pic:blipFill>
-                          <a:blip r:embed="rId17">
+                          <a:blip r:embed="rId17" cstate="print">
                             <a:extLst>
                               <a:ext uri="{28A0092B-C50C-407E-A947-70E740481C1C}">
                                 <a14:useLocalDpi xmlns:a14="http://schemas.microsoft.com/office/drawing/2010/main" val="0"/>
@@ -18619,7 +18475,7 @@
                         <pic:spPr bwMode="auto">
                           <a:xfrm>
                             <a:off x="0" y="0"/>
-                            <a:ext cx="6400800" cy="2837815"/>
+                            <a:ext cx="5486400" cy="2911384"/>
                           </a:xfrm>
                           <a:prstGeom prst="rect">
                             <a:avLst/>
@@ -18635,97 +18491,15 @@
                 </wp:inline>
               </w:drawing>
             </w:r>
-          </w:p>
-        </w:tc>
-      </w:tr>
-      <w:tr>
-        <w:tc>
-          <w:tcPr>
-            <w:tcW w:w="3200" w:type="dxa"/>
-            <w:tcBorders>
-              <w:top w:val="single" w:sz="1" w:space="0" w:color="AAAAAA"/>
-              <w:left w:val="single" w:sz="1" w:space="0" w:color="AAAAAA"/>
-              <w:bottom w:val="single" w:sz="1" w:space="0" w:color="AAAAAA"/>
-              <w:right w:val="single" w:sz="1" w:space="0" w:color="AAAAAA"/>
-            </w:tcBorders>
-            <w:shd w:val="clear" w:color="auto" w:fill="EBF3FA"/>
-            <w:tcMar>
-              <w:top w:w="80" w:type="dxa"/>
-              <w:left w:w="120" w:type="dxa"/>
-              <w:bottom w:w="80" w:type="dxa"/>
-              <w:right w:w="120" w:type="dxa"/>
-            </w:tcMar>
-            <w:vAlign w:val="center"/>
-          </w:tcPr>
-          <w:p>
-            <w:pPr>
-              <w:jc w:val="both"/>
-            </w:pPr>
-            <w:r>
-              <w:rPr>
-                <w:b/>
-                <w:bCs/>
-                <w:color w:val="000000"/>
-                <w:sz w:val="20"/>
-                <w:szCs w:val="20"/>
-              </w:rPr>
-              <w:lastRenderedPageBreak/>
-              <w:t xml:space="preserve">Live </w:t>
-            </w:r>
-            <w:proofErr w:type="spellStart"/>
-            <w:r>
-              <w:rPr>
-                <w:b/>
-                <w:bCs/>
-                <w:color w:val="000000"/>
-                <w:sz w:val="20"/>
-                <w:szCs w:val="20"/>
-              </w:rPr>
-              <w:t>PakVista</w:t>
-            </w:r>
-            <w:proofErr w:type="spellEnd"/>
-            <w:r>
-              <w:rPr>
-                <w:b/>
-                <w:bCs/>
-                <w:color w:val="000000"/>
-                <w:sz w:val="20"/>
-                <w:szCs w:val="20"/>
-              </w:rPr>
-              <w:t xml:space="preserve"> – Production Render Service (all 5 pages accessible)</w:t>
-            </w:r>
-          </w:p>
-        </w:tc>
-        <w:tc>
-          <w:tcPr>
-            <w:tcW w:w="6160" w:type="dxa"/>
-            <w:tcBorders>
-              <w:top w:val="single" w:sz="1" w:space="0" w:color="AAAAAA"/>
-              <w:left w:val="single" w:sz="1" w:space="0" w:color="AAAAAA"/>
-              <w:bottom w:val="single" w:sz="1" w:space="0" w:color="AAAAAA"/>
-              <w:right w:val="single" w:sz="1" w:space="0" w:color="AAAAAA"/>
-            </w:tcBorders>
-            <w:shd w:val="clear" w:color="auto" w:fill="EBF3FA"/>
-            <w:tcMar>
-              <w:top w:w="80" w:type="dxa"/>
-              <w:left w:w="120" w:type="dxa"/>
-              <w:bottom w:w="80" w:type="dxa"/>
-              <w:right w:w="120" w:type="dxa"/>
-            </w:tcMar>
-          </w:tcPr>
-          <w:p>
-            <w:pPr>
-              <w:jc w:val="both"/>
-            </w:pPr>
             <w:r>
               <w:rPr>
                 <w:noProof/>
               </w:rPr>
               <w:drawing>
-                <wp:inline distT="0" distB="0" distL="0" distR="0" wp14:anchorId="3013ED76" wp14:editId="5EAB8A6A">
-                  <wp:extent cx="6400800" cy="2821305"/>
-                  <wp:effectExtent l="0" t="0" r="0" b="0"/>
-                  <wp:docPr id="1911319710" name="Picture 22"/>
+                <wp:inline distT="0" distB="0" distL="0" distR="0" wp14:anchorId="37B77C87" wp14:editId="2F1CEB84">
+                  <wp:extent cx="5486400" cy="2911384"/>
+                  <wp:effectExtent l="0" t="0" r="0" b="3810"/>
+                  <wp:docPr id="1180653488" name="Picture 5"/>
                   <wp:cNvGraphicFramePr>
                     <a:graphicFrameLocks xmlns:a="http://schemas.openxmlformats.org/drawingml/2006/main" noChangeAspect="1"/>
                   </wp:cNvGraphicFramePr>
@@ -18733,13 +18507,13 @@
                     <a:graphicData uri="http://schemas.openxmlformats.org/drawingml/2006/picture">
                       <pic:pic xmlns:pic="http://schemas.openxmlformats.org/drawingml/2006/picture">
                         <pic:nvPicPr>
-                          <pic:cNvPr id="0" name="Picture 45"/>
+                          <pic:cNvPr id="0" name="Picture 5"/>
                           <pic:cNvPicPr>
                             <a:picLocks noChangeAspect="1" noChangeArrowheads="1"/>
                           </pic:cNvPicPr>
                         </pic:nvPicPr>
                         <pic:blipFill>
-                          <a:blip r:embed="rId18">
+                          <a:blip r:embed="rId18" cstate="print">
                             <a:extLst>
                               <a:ext uri="{28A0092B-C50C-407E-A947-70E740481C1C}">
                                 <a14:useLocalDpi xmlns:a14="http://schemas.microsoft.com/office/drawing/2010/main" val="0"/>
@@ -18754,7 +18528,7 @@
                         <pic:spPr bwMode="auto">
                           <a:xfrm>
                             <a:off x="0" y="0"/>
-                            <a:ext cx="6400800" cy="2821305"/>
+                            <a:ext cx="5486400" cy="2911384"/>
                           </a:xfrm>
                           <a:prstGeom prst="rect">
                             <a:avLst/>
@@ -18774,11 +18548,12 @@
               <w:rPr>
                 <w:noProof/>
               </w:rPr>
+              <w:lastRenderedPageBreak/>
               <w:drawing>
-                <wp:inline distT="0" distB="0" distL="0" distR="0" wp14:anchorId="07899C51" wp14:editId="4CDC1E2A">
-                  <wp:extent cx="6400800" cy="2821305"/>
-                  <wp:effectExtent l="0" t="0" r="0" b="0"/>
-                  <wp:docPr id="1706890109" name="Picture 21"/>
+                <wp:inline distT="0" distB="0" distL="0" distR="0" wp14:anchorId="15312468" wp14:editId="7D43DA5C">
+                  <wp:extent cx="5486400" cy="2908119"/>
+                  <wp:effectExtent l="0" t="0" r="0" b="6985"/>
+                  <wp:docPr id="129188097" name="Picture 4"/>
                   <wp:cNvGraphicFramePr>
                     <a:graphicFrameLocks xmlns:a="http://schemas.openxmlformats.org/drawingml/2006/main" noChangeAspect="1"/>
                   </wp:cNvGraphicFramePr>
@@ -18786,13 +18561,13 @@
                     <a:graphicData uri="http://schemas.openxmlformats.org/drawingml/2006/picture">
                       <pic:pic xmlns:pic="http://schemas.openxmlformats.org/drawingml/2006/picture">
                         <pic:nvPicPr>
-                          <pic:cNvPr id="0" name="Picture 44"/>
+                          <pic:cNvPr id="0" name="Picture 4"/>
                           <pic:cNvPicPr>
                             <a:picLocks noChangeAspect="1" noChangeArrowheads="1"/>
                           </pic:cNvPicPr>
                         </pic:nvPicPr>
                         <pic:blipFill>
-                          <a:blip r:embed="rId19">
+                          <a:blip r:embed="rId19" cstate="print">
                             <a:extLst>
                               <a:ext uri="{28A0092B-C50C-407E-A947-70E740481C1C}">
                                 <a14:useLocalDpi xmlns:a14="http://schemas.microsoft.com/office/drawing/2010/main" val="0"/>
@@ -18807,7 +18582,7 @@
                         <pic:spPr bwMode="auto">
                           <a:xfrm>
                             <a:off x="0" y="0"/>
-                            <a:ext cx="6400800" cy="2821305"/>
+                            <a:ext cx="5486400" cy="2908119"/>
                           </a:xfrm>
                           <a:prstGeom prst="rect">
                             <a:avLst/>
@@ -18823,6 +18598,166 @@
                 </wp:inline>
               </w:drawing>
             </w:r>
+            <w:r>
+              <w:rPr>
+                <w:noProof/>
+              </w:rPr>
+              <w:drawing>
+                <wp:inline distT="0" distB="0" distL="0" distR="0" wp14:anchorId="194E69B3" wp14:editId="527F6B4A">
+                  <wp:extent cx="5486400" cy="2917371"/>
+                  <wp:effectExtent l="0" t="0" r="0" b="0"/>
+                  <wp:docPr id="148540636" name="Picture 3"/>
+                  <wp:cNvGraphicFramePr>
+                    <a:graphicFrameLocks xmlns:a="http://schemas.openxmlformats.org/drawingml/2006/main" noChangeAspect="1"/>
+                  </wp:cNvGraphicFramePr>
+                  <a:graphic xmlns:a="http://schemas.openxmlformats.org/drawingml/2006/main">
+                    <a:graphicData uri="http://schemas.openxmlformats.org/drawingml/2006/picture">
+                      <pic:pic xmlns:pic="http://schemas.openxmlformats.org/drawingml/2006/picture">
+                        <pic:nvPicPr>
+                          <pic:cNvPr id="0" name="Picture 3"/>
+                          <pic:cNvPicPr>
+                            <a:picLocks noChangeAspect="1" noChangeArrowheads="1"/>
+                          </pic:cNvPicPr>
+                        </pic:nvPicPr>
+                        <pic:blipFill>
+                          <a:blip r:embed="rId20" cstate="print">
+                            <a:extLst>
+                              <a:ext uri="{28A0092B-C50C-407E-A947-70E740481C1C}">
+                                <a14:useLocalDpi xmlns:a14="http://schemas.microsoft.com/office/drawing/2010/main" val="0"/>
+                              </a:ext>
+                            </a:extLst>
+                          </a:blip>
+                          <a:srcRect/>
+                          <a:stretch>
+                            <a:fillRect/>
+                          </a:stretch>
+                        </pic:blipFill>
+                        <pic:spPr bwMode="auto">
+                          <a:xfrm>
+                            <a:off x="0" y="0"/>
+                            <a:ext cx="5486400" cy="2917371"/>
+                          </a:xfrm>
+                          <a:prstGeom prst="rect">
+                            <a:avLst/>
+                          </a:prstGeom>
+                          <a:noFill/>
+                          <a:ln>
+                            <a:noFill/>
+                          </a:ln>
+                        </pic:spPr>
+                      </pic:pic>
+                    </a:graphicData>
+                  </a:graphic>
+                </wp:inline>
+              </w:drawing>
+            </w:r>
+            <w:r>
+              <w:rPr>
+                <w:noProof/>
+              </w:rPr>
+              <w:lastRenderedPageBreak/>
+              <w:drawing>
+                <wp:inline distT="0" distB="0" distL="0" distR="0" wp14:anchorId="7039A92D" wp14:editId="6E3DC36F">
+                  <wp:extent cx="5486400" cy="2442210"/>
+                  <wp:effectExtent l="0" t="0" r="0" b="0"/>
+                  <wp:docPr id="1296422014" name="Picture 2"/>
+                  <wp:cNvGraphicFramePr>
+                    <a:graphicFrameLocks xmlns:a="http://schemas.openxmlformats.org/drawingml/2006/main" noChangeAspect="1"/>
+                  </wp:cNvGraphicFramePr>
+                  <a:graphic xmlns:a="http://schemas.openxmlformats.org/drawingml/2006/main">
+                    <a:graphicData uri="http://schemas.openxmlformats.org/drawingml/2006/picture">
+                      <pic:pic xmlns:pic="http://schemas.openxmlformats.org/drawingml/2006/picture">
+                        <pic:nvPicPr>
+                          <pic:cNvPr id="0" name="Picture 2"/>
+                          <pic:cNvPicPr>
+                            <a:picLocks noChangeAspect="1" noChangeArrowheads="1"/>
+                          </pic:cNvPicPr>
+                        </pic:nvPicPr>
+                        <pic:blipFill>
+                          <a:blip r:embed="rId21" cstate="print">
+                            <a:extLst>
+                              <a:ext uri="{28A0092B-C50C-407E-A947-70E740481C1C}">
+                                <a14:useLocalDpi xmlns:a14="http://schemas.microsoft.com/office/drawing/2010/main" val="0"/>
+                              </a:ext>
+                            </a:extLst>
+                          </a:blip>
+                          <a:srcRect/>
+                          <a:stretch>
+                            <a:fillRect/>
+                          </a:stretch>
+                        </pic:blipFill>
+                        <pic:spPr bwMode="auto">
+                          <a:xfrm>
+                            <a:off x="0" y="0"/>
+                            <a:ext cx="5486400" cy="2442210"/>
+                          </a:xfrm>
+                          <a:prstGeom prst="rect">
+                            <a:avLst/>
+                          </a:prstGeom>
+                          <a:noFill/>
+                          <a:ln>
+                            <a:noFill/>
+                          </a:ln>
+                        </pic:spPr>
+                      </pic:pic>
+                    </a:graphicData>
+                  </a:graphic>
+                </wp:inline>
+              </w:drawing>
+            </w:r>
+            <w:r>
+              <w:rPr>
+                <w:noProof/>
+              </w:rPr>
+              <w:drawing>
+                <wp:inline distT="0" distB="0" distL="0" distR="0" wp14:anchorId="6F1C298B" wp14:editId="7A71790C">
+                  <wp:extent cx="5486400" cy="2908119"/>
+                  <wp:effectExtent l="0" t="0" r="0" b="6985"/>
+                  <wp:docPr id="180789451" name="Picture 1"/>
+                  <wp:cNvGraphicFramePr>
+                    <a:graphicFrameLocks xmlns:a="http://schemas.openxmlformats.org/drawingml/2006/main" noChangeAspect="1"/>
+                  </wp:cNvGraphicFramePr>
+                  <a:graphic xmlns:a="http://schemas.openxmlformats.org/drawingml/2006/main">
+                    <a:graphicData uri="http://schemas.openxmlformats.org/drawingml/2006/picture">
+                      <pic:pic xmlns:pic="http://schemas.openxmlformats.org/drawingml/2006/picture">
+                        <pic:nvPicPr>
+                          <pic:cNvPr id="0" name="Picture 1"/>
+                          <pic:cNvPicPr>
+                            <a:picLocks noChangeAspect="1" noChangeArrowheads="1"/>
+                          </pic:cNvPicPr>
+                        </pic:nvPicPr>
+                        <pic:blipFill>
+                          <a:blip r:embed="rId22" cstate="print">
+                            <a:extLst>
+                              <a:ext uri="{28A0092B-C50C-407E-A947-70E740481C1C}">
+                                <a14:useLocalDpi xmlns:a14="http://schemas.microsoft.com/office/drawing/2010/main" val="0"/>
+                              </a:ext>
+                            </a:extLst>
+                          </a:blip>
+                          <a:srcRect/>
+                          <a:stretch>
+                            <a:fillRect/>
+                          </a:stretch>
+                        </pic:blipFill>
+                        <pic:spPr bwMode="auto">
+                          <a:xfrm>
+                            <a:off x="0" y="0"/>
+                            <a:ext cx="5486400" cy="2908119"/>
+                          </a:xfrm>
+                          <a:prstGeom prst="rect">
+                            <a:avLst/>
+                          </a:prstGeom>
+                          <a:noFill/>
+                          <a:ln>
+                            <a:noFill/>
+                          </a:ln>
+                        </pic:spPr>
+                      </pic:pic>
+                    </a:graphicData>
+                  </a:graphic>
+                </wp:inline>
+              </w:drawing>
+            </w:r>
           </w:p>
         </w:tc>
       </w:tr>
@@ -18858,6 +18793,432 @@
                 <w:szCs w:val="20"/>
               </w:rPr>
               <w:lastRenderedPageBreak/>
+              <w:t xml:space="preserve">Live </w:t>
+            </w:r>
+            <w:proofErr w:type="spellStart"/>
+            <w:r>
+              <w:rPr>
+                <w:b/>
+                <w:bCs/>
+                <w:color w:val="000000"/>
+                <w:sz w:val="20"/>
+                <w:szCs w:val="20"/>
+              </w:rPr>
+              <w:t>PakVista</w:t>
+            </w:r>
+            <w:proofErr w:type="spellEnd"/>
+            <w:r>
+              <w:rPr>
+                <w:b/>
+                <w:bCs/>
+                <w:color w:val="000000"/>
+                <w:sz w:val="20"/>
+                <w:szCs w:val="20"/>
+              </w:rPr>
+              <w:t xml:space="preserve"> – Staging Render Service (all 5 pages accessible)</w:t>
+            </w:r>
+          </w:p>
+        </w:tc>
+        <w:tc>
+          <w:tcPr>
+            <w:tcW w:w="6160" w:type="dxa"/>
+            <w:tcBorders>
+              <w:top w:val="single" w:sz="1" w:space="0" w:color="AAAAAA"/>
+              <w:left w:val="single" w:sz="1" w:space="0" w:color="AAAAAA"/>
+              <w:bottom w:val="single" w:sz="1" w:space="0" w:color="AAAAAA"/>
+              <w:right w:val="single" w:sz="1" w:space="0" w:color="AAAAAA"/>
+            </w:tcBorders>
+            <w:shd w:val="clear" w:color="auto" w:fill="FFFFFF"/>
+            <w:tcMar>
+              <w:top w:w="80" w:type="dxa"/>
+              <w:left w:w="120" w:type="dxa"/>
+              <w:bottom w:w="80" w:type="dxa"/>
+              <w:right w:w="120" w:type="dxa"/>
+            </w:tcMar>
+          </w:tcPr>
+          <w:p>
+            <w:pPr>
+              <w:jc w:val="both"/>
+            </w:pPr>
+            <w:r>
+              <w:rPr>
+                <w:noProof/>
+              </w:rPr>
+              <w:drawing>
+                <wp:inline distT="0" distB="0" distL="0" distR="0" wp14:anchorId="4C720807" wp14:editId="012819C6">
+                  <wp:extent cx="5486400" cy="2430236"/>
+                  <wp:effectExtent l="0" t="0" r="0" b="8255"/>
+                  <wp:docPr id="1850916667" name="Picture 8"/>
+                  <wp:cNvGraphicFramePr>
+                    <a:graphicFrameLocks xmlns:a="http://schemas.openxmlformats.org/drawingml/2006/main" noChangeAspect="1"/>
+                  </wp:cNvGraphicFramePr>
+                  <a:graphic xmlns:a="http://schemas.openxmlformats.org/drawingml/2006/main">
+                    <a:graphicData uri="http://schemas.openxmlformats.org/drawingml/2006/picture">
+                      <pic:pic xmlns:pic="http://schemas.openxmlformats.org/drawingml/2006/picture">
+                        <pic:nvPicPr>
+                          <pic:cNvPr id="0" name="Picture 14"/>
+                          <pic:cNvPicPr>
+                            <a:picLocks noChangeAspect="1" noChangeArrowheads="1"/>
+                          </pic:cNvPicPr>
+                        </pic:nvPicPr>
+                        <pic:blipFill>
+                          <a:blip r:embed="rId23" cstate="print">
+                            <a:extLst>
+                              <a:ext uri="{28A0092B-C50C-407E-A947-70E740481C1C}">
+                                <a14:useLocalDpi xmlns:a14="http://schemas.microsoft.com/office/drawing/2010/main" val="0"/>
+                              </a:ext>
+                            </a:extLst>
+                          </a:blip>
+                          <a:srcRect/>
+                          <a:stretch>
+                            <a:fillRect/>
+                          </a:stretch>
+                        </pic:blipFill>
+                        <pic:spPr bwMode="auto">
+                          <a:xfrm>
+                            <a:off x="0" y="0"/>
+                            <a:ext cx="5486400" cy="2430236"/>
+                          </a:xfrm>
+                          <a:prstGeom prst="rect">
+                            <a:avLst/>
+                          </a:prstGeom>
+                          <a:noFill/>
+                          <a:ln>
+                            <a:noFill/>
+                          </a:ln>
+                        </pic:spPr>
+                      </pic:pic>
+                    </a:graphicData>
+                  </a:graphic>
+                </wp:inline>
+              </w:drawing>
+            </w:r>
+            <w:r>
+              <w:rPr>
+                <w:noProof/>
+              </w:rPr>
+              <w:drawing>
+                <wp:inline distT="0" distB="0" distL="0" distR="0" wp14:anchorId="4DAACA2F" wp14:editId="724CA378">
+                  <wp:extent cx="5486400" cy="2911384"/>
+                  <wp:effectExtent l="0" t="0" r="0" b="3810"/>
+                  <wp:docPr id="539144957" name="Picture 7"/>
+                  <wp:cNvGraphicFramePr>
+                    <a:graphicFrameLocks xmlns:a="http://schemas.openxmlformats.org/drawingml/2006/main" noChangeAspect="1"/>
+                  </wp:cNvGraphicFramePr>
+                  <a:graphic xmlns:a="http://schemas.openxmlformats.org/drawingml/2006/main">
+                    <a:graphicData uri="http://schemas.openxmlformats.org/drawingml/2006/picture">
+                      <pic:pic xmlns:pic="http://schemas.openxmlformats.org/drawingml/2006/picture">
+                        <pic:nvPicPr>
+                          <pic:cNvPr id="0" name="Picture 13"/>
+                          <pic:cNvPicPr>
+                            <a:picLocks noChangeAspect="1" noChangeArrowheads="1"/>
+                          </pic:cNvPicPr>
+                        </pic:nvPicPr>
+                        <pic:blipFill>
+                          <a:blip r:embed="rId24" cstate="print">
+                            <a:extLst>
+                              <a:ext uri="{28A0092B-C50C-407E-A947-70E740481C1C}">
+                                <a14:useLocalDpi xmlns:a14="http://schemas.microsoft.com/office/drawing/2010/main" val="0"/>
+                              </a:ext>
+                            </a:extLst>
+                          </a:blip>
+                          <a:srcRect/>
+                          <a:stretch>
+                            <a:fillRect/>
+                          </a:stretch>
+                        </pic:blipFill>
+                        <pic:spPr bwMode="auto">
+                          <a:xfrm>
+                            <a:off x="0" y="0"/>
+                            <a:ext cx="5486400" cy="2911384"/>
+                          </a:xfrm>
+                          <a:prstGeom prst="rect">
+                            <a:avLst/>
+                          </a:prstGeom>
+                          <a:noFill/>
+                          <a:ln>
+                            <a:noFill/>
+                          </a:ln>
+                        </pic:spPr>
+                      </pic:pic>
+                    </a:graphicData>
+                  </a:graphic>
+                </wp:inline>
+              </w:drawing>
+            </w:r>
+          </w:p>
+        </w:tc>
+      </w:tr>
+      <w:tr>
+        <w:tc>
+          <w:tcPr>
+            <w:tcW w:w="3200" w:type="dxa"/>
+            <w:tcBorders>
+              <w:top w:val="single" w:sz="1" w:space="0" w:color="AAAAAA"/>
+              <w:left w:val="single" w:sz="1" w:space="0" w:color="AAAAAA"/>
+              <w:bottom w:val="single" w:sz="1" w:space="0" w:color="AAAAAA"/>
+              <w:right w:val="single" w:sz="1" w:space="0" w:color="AAAAAA"/>
+            </w:tcBorders>
+            <w:shd w:val="clear" w:color="auto" w:fill="EBF3FA"/>
+            <w:tcMar>
+              <w:top w:w="80" w:type="dxa"/>
+              <w:left w:w="120" w:type="dxa"/>
+              <w:bottom w:w="80" w:type="dxa"/>
+              <w:right w:w="120" w:type="dxa"/>
+            </w:tcMar>
+            <w:vAlign w:val="center"/>
+          </w:tcPr>
+          <w:p>
+            <w:pPr>
+              <w:jc w:val="both"/>
+            </w:pPr>
+            <w:r>
+              <w:rPr>
+                <w:b/>
+                <w:bCs/>
+                <w:color w:val="000000"/>
+                <w:sz w:val="20"/>
+                <w:szCs w:val="20"/>
+              </w:rPr>
+              <w:lastRenderedPageBreak/>
+              <w:t xml:space="preserve">Live </w:t>
+            </w:r>
+            <w:proofErr w:type="spellStart"/>
+            <w:r>
+              <w:rPr>
+                <w:b/>
+                <w:bCs/>
+                <w:color w:val="000000"/>
+                <w:sz w:val="20"/>
+                <w:szCs w:val="20"/>
+              </w:rPr>
+              <w:t>PakVista</w:t>
+            </w:r>
+            <w:proofErr w:type="spellEnd"/>
+            <w:r>
+              <w:rPr>
+                <w:b/>
+                <w:bCs/>
+                <w:color w:val="000000"/>
+                <w:sz w:val="20"/>
+                <w:szCs w:val="20"/>
+              </w:rPr>
+              <w:t xml:space="preserve"> – Production Render Service (all 5 pages accessible)</w:t>
+            </w:r>
+          </w:p>
+        </w:tc>
+        <w:tc>
+          <w:tcPr>
+            <w:tcW w:w="6160" w:type="dxa"/>
+            <w:tcBorders>
+              <w:top w:val="single" w:sz="1" w:space="0" w:color="AAAAAA"/>
+              <w:left w:val="single" w:sz="1" w:space="0" w:color="AAAAAA"/>
+              <w:bottom w:val="single" w:sz="1" w:space="0" w:color="AAAAAA"/>
+              <w:right w:val="single" w:sz="1" w:space="0" w:color="AAAAAA"/>
+            </w:tcBorders>
+            <w:shd w:val="clear" w:color="auto" w:fill="EBF3FA"/>
+            <w:tcMar>
+              <w:top w:w="80" w:type="dxa"/>
+              <w:left w:w="120" w:type="dxa"/>
+              <w:bottom w:w="80" w:type="dxa"/>
+              <w:right w:w="120" w:type="dxa"/>
+            </w:tcMar>
+          </w:tcPr>
+          <w:p>
+            <w:r>
+              <w:rPr>
+                <w:noProof/>
+              </w:rPr>
+              <w:drawing>
+                <wp:inline distT="0" distB="0" distL="0" distR="0" wp14:anchorId="4C13BB83" wp14:editId="66A20FFF">
+                  <wp:extent cx="5486400" cy="2418261"/>
+                  <wp:effectExtent l="0" t="0" r="0" b="1270"/>
+                  <wp:docPr id="367009621" name="Picture 11"/>
+                  <wp:cNvGraphicFramePr>
+                    <a:graphicFrameLocks xmlns:a="http://schemas.openxmlformats.org/drawingml/2006/main" noChangeAspect="1"/>
+                  </wp:cNvGraphicFramePr>
+                  <a:graphic xmlns:a="http://schemas.openxmlformats.org/drawingml/2006/main">
+                    <a:graphicData uri="http://schemas.openxmlformats.org/drawingml/2006/picture">
+                      <pic:pic xmlns:pic="http://schemas.openxmlformats.org/drawingml/2006/picture">
+                        <pic:nvPicPr>
+                          <pic:cNvPr id="0" name="Picture 19"/>
+                          <pic:cNvPicPr>
+                            <a:picLocks noChangeAspect="1" noChangeArrowheads="1"/>
+                          </pic:cNvPicPr>
+                        </pic:nvPicPr>
+                        <pic:blipFill>
+                          <a:blip r:embed="rId25" cstate="print">
+                            <a:extLst>
+                              <a:ext uri="{28A0092B-C50C-407E-A947-70E740481C1C}">
+                                <a14:useLocalDpi xmlns:a14="http://schemas.microsoft.com/office/drawing/2010/main" val="0"/>
+                              </a:ext>
+                            </a:extLst>
+                          </a:blip>
+                          <a:srcRect/>
+                          <a:stretch>
+                            <a:fillRect/>
+                          </a:stretch>
+                        </pic:blipFill>
+                        <pic:spPr bwMode="auto">
+                          <a:xfrm>
+                            <a:off x="0" y="0"/>
+                            <a:ext cx="5486400" cy="2418261"/>
+                          </a:xfrm>
+                          <a:prstGeom prst="rect">
+                            <a:avLst/>
+                          </a:prstGeom>
+                          <a:noFill/>
+                          <a:ln>
+                            <a:noFill/>
+                          </a:ln>
+                        </pic:spPr>
+                      </pic:pic>
+                    </a:graphicData>
+                  </a:graphic>
+                </wp:inline>
+              </w:drawing>
+            </w:r>
+            <w:r>
+              <w:rPr>
+                <w:noProof/>
+              </w:rPr>
+              <w:drawing>
+                <wp:inline distT="0" distB="0" distL="0" distR="0" wp14:anchorId="2C0D645C" wp14:editId="2B39E20E">
+                  <wp:extent cx="5486400" cy="2418261"/>
+                  <wp:effectExtent l="0" t="0" r="0" b="1270"/>
+                  <wp:docPr id="553847783" name="Picture 10"/>
+                  <wp:cNvGraphicFramePr>
+                    <a:graphicFrameLocks xmlns:a="http://schemas.openxmlformats.org/drawingml/2006/main" noChangeAspect="1"/>
+                  </wp:cNvGraphicFramePr>
+                  <a:graphic xmlns:a="http://schemas.openxmlformats.org/drawingml/2006/main">
+                    <a:graphicData uri="http://schemas.openxmlformats.org/drawingml/2006/picture">
+                      <pic:pic xmlns:pic="http://schemas.openxmlformats.org/drawingml/2006/picture">
+                        <pic:nvPicPr>
+                          <pic:cNvPr id="0" name="Picture 18"/>
+                          <pic:cNvPicPr>
+                            <a:picLocks noChangeAspect="1" noChangeArrowheads="1"/>
+                          </pic:cNvPicPr>
+                        </pic:nvPicPr>
+                        <pic:blipFill>
+                          <a:blip r:embed="rId26" cstate="print">
+                            <a:extLst>
+                              <a:ext uri="{28A0092B-C50C-407E-A947-70E740481C1C}">
+                                <a14:useLocalDpi xmlns:a14="http://schemas.microsoft.com/office/drawing/2010/main" val="0"/>
+                              </a:ext>
+                            </a:extLst>
+                          </a:blip>
+                          <a:srcRect/>
+                          <a:stretch>
+                            <a:fillRect/>
+                          </a:stretch>
+                        </pic:blipFill>
+                        <pic:spPr bwMode="auto">
+                          <a:xfrm>
+                            <a:off x="0" y="0"/>
+                            <a:ext cx="5486400" cy="2418261"/>
+                          </a:xfrm>
+                          <a:prstGeom prst="rect">
+                            <a:avLst/>
+                          </a:prstGeom>
+                          <a:noFill/>
+                          <a:ln>
+                            <a:noFill/>
+                          </a:ln>
+                        </pic:spPr>
+                      </pic:pic>
+                    </a:graphicData>
+                  </a:graphic>
+                </wp:inline>
+              </w:drawing>
+            </w:r>
+            <w:r>
+              <w:rPr>
+                <w:noProof/>
+              </w:rPr>
+              <w:drawing>
+                <wp:inline distT="0" distB="0" distL="0" distR="0" wp14:anchorId="18CFFA1C" wp14:editId="031A83AB">
+                  <wp:extent cx="5486400" cy="2891790"/>
+                  <wp:effectExtent l="0" t="0" r="0" b="3810"/>
+                  <wp:docPr id="1379183908" name="Picture 9"/>
+                  <wp:cNvGraphicFramePr>
+                    <a:graphicFrameLocks xmlns:a="http://schemas.openxmlformats.org/drawingml/2006/main" noChangeAspect="1"/>
+                  </wp:cNvGraphicFramePr>
+                  <a:graphic xmlns:a="http://schemas.openxmlformats.org/drawingml/2006/main">
+                    <a:graphicData uri="http://schemas.openxmlformats.org/drawingml/2006/picture">
+                      <pic:pic xmlns:pic="http://schemas.openxmlformats.org/drawingml/2006/picture">
+                        <pic:nvPicPr>
+                          <pic:cNvPr id="0" name="Picture 17"/>
+                          <pic:cNvPicPr>
+                            <a:picLocks noChangeAspect="1" noChangeArrowheads="1"/>
+                          </pic:cNvPicPr>
+                        </pic:nvPicPr>
+                        <pic:blipFill>
+                          <a:blip r:embed="rId27" cstate="print">
+                            <a:extLst>
+                              <a:ext uri="{28A0092B-C50C-407E-A947-70E740481C1C}">
+                                <a14:useLocalDpi xmlns:a14="http://schemas.microsoft.com/office/drawing/2010/main" val="0"/>
+                              </a:ext>
+                            </a:extLst>
+                          </a:blip>
+                          <a:srcRect/>
+                          <a:stretch>
+                            <a:fillRect/>
+                          </a:stretch>
+                        </pic:blipFill>
+                        <pic:spPr bwMode="auto">
+                          <a:xfrm>
+                            <a:off x="0" y="0"/>
+                            <a:ext cx="5486400" cy="2891790"/>
+                          </a:xfrm>
+                          <a:prstGeom prst="rect">
+                            <a:avLst/>
+                          </a:prstGeom>
+                          <a:noFill/>
+                          <a:ln>
+                            <a:noFill/>
+                          </a:ln>
+                        </pic:spPr>
+                      </pic:pic>
+                    </a:graphicData>
+                  </a:graphic>
+                </wp:inline>
+              </w:drawing>
+            </w:r>
+          </w:p>
+        </w:tc>
+      </w:tr>
+      <w:tr>
+        <w:tc>
+          <w:tcPr>
+            <w:tcW w:w="3200" w:type="dxa"/>
+            <w:tcBorders>
+              <w:top w:val="single" w:sz="1" w:space="0" w:color="AAAAAA"/>
+              <w:left w:val="single" w:sz="1" w:space="0" w:color="AAAAAA"/>
+              <w:bottom w:val="single" w:sz="1" w:space="0" w:color="AAAAAA"/>
+              <w:right w:val="single" w:sz="1" w:space="0" w:color="AAAAAA"/>
+            </w:tcBorders>
+            <w:shd w:val="clear" w:color="auto" w:fill="FFFFFF"/>
+            <w:tcMar>
+              <w:top w:w="80" w:type="dxa"/>
+              <w:left w:w="120" w:type="dxa"/>
+              <w:bottom w:w="80" w:type="dxa"/>
+              <w:right w:w="120" w:type="dxa"/>
+            </w:tcMar>
+            <w:vAlign w:val="center"/>
+          </w:tcPr>
+          <w:p>
+            <w:pPr>
+              <w:jc w:val="both"/>
+            </w:pPr>
+            <w:r>
+              <w:rPr>
+                <w:b/>
+                <w:bCs/>
+                <w:color w:val="000000"/>
+                <w:sz w:val="20"/>
+                <w:szCs w:val="20"/>
+              </w:rPr>
+              <w:lastRenderedPageBreak/>
               <w:t>Term Project .docx visible in GitHub Repository file listing</w:t>
             </w:r>
           </w:p>
@@ -18884,10 +19245,13 @@
               <w:jc w:val="both"/>
             </w:pPr>
             <w:r>
+              <w:rPr>
+                <w:noProof/>
+              </w:rPr>
               <w:drawing>
-                <wp:inline distT="0" distB="0" distL="0" distR="0" wp14:anchorId="0E59C30E" wp14:editId="249C9D7F">
-                  <wp:extent cx="6400800" cy="3003550"/>
-                  <wp:effectExtent l="0" t="0" r="0" b="6350"/>
+                <wp:inline distT="0" distB="0" distL="0" distR="0" wp14:anchorId="0E59C30E" wp14:editId="34DD83BD">
+                  <wp:extent cx="5486400" cy="2574471"/>
+                  <wp:effectExtent l="0" t="0" r="0" b="0"/>
                   <wp:docPr id="583373570" name="Picture 1"/>
                   <wp:cNvGraphicFramePr>
                     <a:graphicFrameLocks xmlns:a="http://schemas.openxmlformats.org/drawingml/2006/main" noChangeAspect="1"/>
@@ -18900,7 +19264,7 @@
                           <pic:cNvPicPr/>
                         </pic:nvPicPr>
                         <pic:blipFill>
-                          <a:blip r:embed="rId20"/>
+                          <a:blip r:embed="rId28"/>
                           <a:stretch>
                             <a:fillRect/>
                           </a:stretch>
@@ -18908,7 +19272,7 @@
                         <pic:spPr>
                           <a:xfrm>
                             <a:off x="0" y="0"/>
-                            <a:ext cx="6400800" cy="3003550"/>
+                            <a:ext cx="5486400" cy="2574471"/>
                           </a:xfrm>
                           <a:prstGeom prst="rect">
                             <a:avLst/>
@@ -19261,13 +19625,7 @@
         <w:rPr>
           <w:color w:val="2E75B6"/>
         </w:rPr>
-        <w:t>overall delivery process.</w:t>
-      </w:r>
-      <w:r>
-        <w:rPr>
-          <w:color w:val="2E75B6"/>
-        </w:rPr>
-        <w:t xml:space="preserve"> </w:t>
+        <w:t xml:space="preserve">overall delivery process. </w:t>
       </w:r>
     </w:p>
     <w:p>
@@ -19301,8 +19659,52 @@
           <w:bCs/>
           <w:color w:val="2E75B6"/>
         </w:rPr>
+        <w:t>Abu Bakar Saeed</w:t>
+      </w:r>
+    </w:p>
+    <w:p>
+      <w:pPr>
+        <w:spacing w:before="100" w:after="40"/>
+        <w:jc w:val="both"/>
+        <w:rPr>
+          <w:color w:val="2E75B6"/>
+        </w:rPr>
+      </w:pPr>
+      <w:r>
+        <w:rPr>
+          <w:color w:val="2E75B6"/>
+        </w:rPr>
+        <w:t>My contribution was building the Lahore page and writing the cd-</w:t>
+      </w:r>
+      <w:proofErr w:type="spellStart"/>
+      <w:r>
+        <w:rPr>
+          <w:color w:val="2E75B6"/>
+        </w:rPr>
+        <w:t>dev.yml</w:t>
+      </w:r>
+      <w:proofErr w:type="spellEnd"/>
+      <w:r>
+        <w:rPr>
+          <w:color w:val="2E75B6"/>
+        </w:rPr>
+        <w:t xml:space="preserve"> deployment</w:t>
+      </w:r>
+    </w:p>
+    <w:p>
+      <w:pPr>
+        <w:spacing w:before="100" w:after="40"/>
+        <w:jc w:val="both"/>
+        <w:rPr>
+          <w:color w:val="2E75B6"/>
+        </w:rPr>
+      </w:pPr>
+      <w:r>
+        <w:rPr>
+          <w:color w:val="2E75B6"/>
+        </w:rPr>
         <w:lastRenderedPageBreak/>
-        <w:t>Abu Bakar Saeed</w:t>
+        <w:t>workflow for the Development environment. Before this project, I had</w:t>
       </w:r>
     </w:p>
     <w:p>
@@ -19317,21 +19719,36 @@
         <w:rPr>
           <w:color w:val="2E75B6"/>
         </w:rPr>
-        <w:t>My contribution was building the Lahore page and writing the cd-</w:t>
-      </w:r>
-      <w:proofErr w:type="spellStart"/>
-      <w:r>
+        <w:t>never written a GitHub Actions workflow file. Understanding the YAML syntax</w:t>
+      </w:r>
+    </w:p>
+    <w:p>
+      <w:pPr>
+        <w:spacing w:before="100" w:after="40"/>
+        <w:jc w:val="both"/>
         <w:rPr>
           <w:color w:val="2E75B6"/>
         </w:rPr>
-        <w:t>dev.yml</w:t>
-      </w:r>
-      <w:proofErr w:type="spellEnd"/>
+      </w:pPr>
       <w:r>
         <w:rPr>
           <w:color w:val="2E75B6"/>
         </w:rPr>
-        <w:t xml:space="preserve"> deployment</w:t>
+        <w:t xml:space="preserve">and how triggers, jobs, and steps </w:t>
+      </w:r>
+      <w:proofErr w:type="gramStart"/>
+      <w:r>
+        <w:rPr>
+          <w:color w:val="2E75B6"/>
+        </w:rPr>
+        <w:t>connect together</w:t>
+      </w:r>
+      <w:proofErr w:type="gramEnd"/>
+      <w:r>
+        <w:rPr>
+          <w:color w:val="2E75B6"/>
+        </w:rPr>
+        <w:t xml:space="preserve"> was challenging at first, but</w:t>
       </w:r>
     </w:p>
     <w:p>
@@ -19346,84 +19763,19 @@
         <w:rPr>
           <w:color w:val="2E75B6"/>
         </w:rPr>
-        <w:t>workflow for the Development environment. Before this project, I had</w:t>
+        <w:t>clicking through once it worked was very satisfying. I also learned how Docker</w:t>
       </w:r>
     </w:p>
     <w:p>
       <w:pPr>
         <w:spacing w:before="100" w:after="40"/>
         <w:jc w:val="both"/>
+      </w:pPr>
+      <w:r>
         <w:rPr>
           <w:color w:val="2E75B6"/>
         </w:rPr>
-      </w:pPr>
-      <w:r>
-        <w:rPr>
-          <w:color w:val="2E75B6"/>
-        </w:rPr>
-        <w:t>never written a GitHub Actions workflow file. Understanding the YAML syntax</w:t>
-      </w:r>
-    </w:p>
-    <w:p>
-      <w:pPr>
-        <w:spacing w:before="100" w:after="40"/>
-        <w:jc w:val="both"/>
-        <w:rPr>
-          <w:color w:val="2E75B6"/>
-        </w:rPr>
-      </w:pPr>
-      <w:r>
-        <w:rPr>
-          <w:color w:val="2E75B6"/>
-        </w:rPr>
-        <w:t xml:space="preserve">and how triggers, jobs, and steps </w:t>
-      </w:r>
-      <w:proofErr w:type="gramStart"/>
-      <w:r>
-        <w:rPr>
-          <w:color w:val="2E75B6"/>
-        </w:rPr>
-        <w:t>connect together</w:t>
-      </w:r>
-      <w:proofErr w:type="gramEnd"/>
-      <w:r>
-        <w:rPr>
-          <w:color w:val="2E75B6"/>
-        </w:rPr>
-        <w:t xml:space="preserve"> was challenging at first, but</w:t>
-      </w:r>
-    </w:p>
-    <w:p>
-      <w:pPr>
-        <w:spacing w:before="100" w:after="40"/>
-        <w:jc w:val="both"/>
-        <w:rPr>
-          <w:color w:val="2E75B6"/>
-        </w:rPr>
-      </w:pPr>
-      <w:r>
-        <w:rPr>
-          <w:color w:val="2E75B6"/>
-        </w:rPr>
-        <w:t>clicking through once it worked was very satisfying. I also learned how Docker</w:t>
-      </w:r>
-    </w:p>
-    <w:p>
-      <w:pPr>
-        <w:spacing w:before="100" w:after="40"/>
-        <w:jc w:val="both"/>
-      </w:pPr>
-      <w:r>
-        <w:rPr>
-          <w:color w:val="2E75B6"/>
-        </w:rPr>
-        <w:t>images are built and tagged, which I think will be very useful going forward.</w:t>
-      </w:r>
-      <w:r>
-        <w:rPr>
-          <w:color w:val="2E75B6"/>
-        </w:rPr>
-        <w:t xml:space="preserve"> </w:t>
+        <w:t xml:space="preserve">images are built and tagged, which I think will be very useful going forward. </w:t>
       </w:r>
     </w:p>
     <w:p>
@@ -21217,8 +21569,8 @@
       </w:pPr>
     </w:p>
     <w:sectPr>
-      <w:headerReference w:type="default" r:id="rId21"/>
-      <w:footerReference w:type="default" r:id="rId22"/>
+      <w:headerReference w:type="default" r:id="rId29"/>
+      <w:footerReference w:type="default" r:id="rId30"/>
       <w:pgSz w:w="12240" w:h="15840"/>
       <w:pgMar w:top="1080" w:right="1080" w:bottom="1080" w:left="1080" w:header="708" w:footer="708" w:gutter="0"/>
       <w:cols w:space="720"/>
@@ -22399,6 +22751,7 @@
   <w:style w:type="character" w:default="1" w:styleId="DefaultParagraphFont">
     <w:name w:val="Default Paragraph Font"/>
     <w:uiPriority w:val="1"/>
+    <w:semiHidden/>
     <w:unhideWhenUsed/>
   </w:style>
   <w:style w:type="table" w:default="1" w:styleId="TableNormal">
@@ -22864,4 +23217,16 @@
     </a:ext>
   </a:extLst>
 </a:theme>
+</file>
+
+<file path=customXml/item1.xml><?xml version="1.0" encoding="utf-8"?>
+<b:Sources xmlns:b="http://schemas.openxmlformats.org/officeDocument/2006/bibliography" xmlns="http://schemas.openxmlformats.org/officeDocument/2006/bibliography" SelectedStyle="\APASixthEditionOfficeOnline.xsl" StyleName="APA" Version="6"/>
+</file>
+
+<file path=customXml/itemProps1.xml><?xml version="1.0" encoding="utf-8"?>
+<ds:datastoreItem xmlns:ds="http://schemas.openxmlformats.org/officeDocument/2006/customXml" ds:itemID="{770CD8F8-CEEA-4D5A-8EB3-E70EC54D6782}">
+  <ds:schemaRefs>
+    <ds:schemaRef ds:uri="http://schemas.openxmlformats.org/officeDocument/2006/bibliography"/>
+  </ds:schemaRefs>
+</ds:datastoreItem>
 </file>
</xml_diff>